<commit_message>
add files for generalization
</commit_message>
<xml_diff>
--- a/annotations/annotation_guide_catalysis/annotation_guide.docx
+++ b/annotations/annotation_guide_catalysis/annotation_guide.docx
@@ -9,6 +9,19 @@
       <w:r>
         <w:t>Human Annotation Guide - Catalysis Performance Data</w:t>
       </w:r>
+    </w:p>
+    <w:p>
+      <w:r>
+        <w:t xml:space="preserve">There is a screen recording showing this in the drive: </w:t>
+      </w:r>
+      <w:hyperlink r:id="rId6" w:history="1">
+        <w:r>
+          <w:rPr>
+            <w:rStyle w:val="Hyperlink"/>
+          </w:rPr>
+          <w:t>annotation_guide_recording.mov</w:t>
+        </w:r>
+      </w:hyperlink>
     </w:p>
     <w:p>
       <w:pPr>
@@ -557,14 +570,9 @@
       </w:r>
       <w:proofErr w:type="spellStart"/>
       <w:r>
-        <w:t>dummy_</w:t>
-      </w:r>
-      <w:proofErr w:type="gramStart"/>
-      <w:r>
-        <w:t>double.json</w:t>
+        <w:t>dummy_double.json</w:t>
       </w:r>
       <w:proofErr w:type="spellEnd"/>
-      <w:proofErr w:type="gramEnd"/>
       <w:r>
         <w:t>).</w:t>
       </w:r>
@@ -12179,6 +12187,18 @@
       </w:tcPr>
     </w:tblStylePr>
   </w:style>
+  <w:style w:type="character" w:styleId="Hyperlink">
+    <w:name w:val="Hyperlink"/>
+    <w:basedOn w:val="DefaultParagraphFont"/>
+    <w:uiPriority w:val="99"/>
+    <w:semiHidden/>
+    <w:unhideWhenUsed/>
+    <w:rsid w:val="00FD67EE"/>
+    <w:rPr>
+      <w:color w:val="0000FF"/>
+      <w:u w:val="single"/>
+    </w:rPr>
+  </w:style>
 </w:styles>
 </file>
 

</xml_diff>